<commit_message>
Update requirements.txt with specific package versions; modify Jupyter notebook for enhanced data analysis
</commit_message>
<xml_diff>
--- a/data/data_attributes.docx
+++ b/data/data_attributes.docx
@@ -77,16 +77,29 @@
           <w14:ligatures w14:val="none"/>
         </w:rPr>
       </w:pPr>
-      <w:r>
-        <w:rPr>
-          <w:rFonts w:ascii="inherit" w:eastAsia="Times New Roman" w:hAnsi="inherit" w:cs="Arial"/>
-          <w:color w:val="3C4043"/>
-          <w:kern w:val="0"/>
-          <w:sz w:val="21"/>
-          <w:szCs w:val="21"/>
-          <w14:ligatures w14:val="none"/>
-        </w:rPr>
-        <w:t>ChestPainType: chest pain type [TA: Typical Angina, ATA: Atypical Angina, NAP: Non-Anginal Pain, ASY: Asymptomatic]</w:t>
+      <w:proofErr w:type="spellStart"/>
+      <w:r>
+        <w:rPr>
+          <w:rFonts w:ascii="inherit" w:eastAsia="Times New Roman" w:hAnsi="inherit" w:cs="Arial"/>
+          <w:color w:val="3C4043"/>
+          <w:kern w:val="0"/>
+          <w:sz w:val="21"/>
+          <w:szCs w:val="21"/>
+          <w14:ligatures w14:val="none"/>
+        </w:rPr>
+        <w:t>ChestPainType</w:t>
+      </w:r>
+      <w:proofErr w:type="spellEnd"/>
+      <w:r>
+        <w:rPr>
+          <w:rFonts w:ascii="inherit" w:eastAsia="Times New Roman" w:hAnsi="inherit" w:cs="Arial"/>
+          <w:color w:val="3C4043"/>
+          <w:kern w:val="0"/>
+          <w:sz w:val="21"/>
+          <w:szCs w:val="21"/>
+          <w14:ligatures w14:val="none"/>
+        </w:rPr>
+        <w:t>: chest pain type [TA: Typical Angina, ATA: Atypical Angina, NAP: Non-Anginal Pain, ASY: Asymptomatic]</w:t>
       </w:r>
     </w:p>
     <w:p>
@@ -106,16 +119,29 @@
           <w14:ligatures w14:val="none"/>
         </w:rPr>
       </w:pPr>
-      <w:r>
-        <w:rPr>
-          <w:rFonts w:ascii="inherit" w:eastAsia="Times New Roman" w:hAnsi="inherit" w:cs="Arial"/>
-          <w:color w:val="3C4043"/>
-          <w:kern w:val="0"/>
-          <w:sz w:val="21"/>
-          <w:szCs w:val="21"/>
-          <w14:ligatures w14:val="none"/>
-        </w:rPr>
-        <w:t>RestingBP: resting blood pressure [mm Hg]</w:t>
+      <w:proofErr w:type="spellStart"/>
+      <w:r>
+        <w:rPr>
+          <w:rFonts w:ascii="inherit" w:eastAsia="Times New Roman" w:hAnsi="inherit" w:cs="Arial"/>
+          <w:color w:val="3C4043"/>
+          <w:kern w:val="0"/>
+          <w:sz w:val="21"/>
+          <w:szCs w:val="21"/>
+          <w14:ligatures w14:val="none"/>
+        </w:rPr>
+        <w:t>RestingBP</w:t>
+      </w:r>
+      <w:proofErr w:type="spellEnd"/>
+      <w:r>
+        <w:rPr>
+          <w:rFonts w:ascii="inherit" w:eastAsia="Times New Roman" w:hAnsi="inherit" w:cs="Arial"/>
+          <w:color w:val="3C4043"/>
+          <w:kern w:val="0"/>
+          <w:sz w:val="21"/>
+          <w:szCs w:val="21"/>
+          <w14:ligatures w14:val="none"/>
+        </w:rPr>
+        <w:t>: resting blood pressure [mm Hg]</w:t>
       </w:r>
     </w:p>
     <w:p>
@@ -164,16 +190,53 @@
           <w14:ligatures w14:val="none"/>
         </w:rPr>
       </w:pPr>
-      <w:r>
-        <w:rPr>
-          <w:rFonts w:ascii="inherit" w:eastAsia="Times New Roman" w:hAnsi="inherit" w:cs="Arial"/>
-          <w:color w:val="3C4043"/>
-          <w:kern w:val="0"/>
-          <w:sz w:val="21"/>
-          <w:szCs w:val="21"/>
-          <w14:ligatures w14:val="none"/>
-        </w:rPr>
-        <w:t>FastingBS: fasting blood sugar [1: if FastingBS &gt; 120 mg/dl, 0: otherwise]</w:t>
+      <w:proofErr w:type="spellStart"/>
+      <w:r>
+        <w:rPr>
+          <w:rFonts w:ascii="inherit" w:eastAsia="Times New Roman" w:hAnsi="inherit" w:cs="Arial"/>
+          <w:color w:val="3C4043"/>
+          <w:kern w:val="0"/>
+          <w:sz w:val="21"/>
+          <w:szCs w:val="21"/>
+          <w14:ligatures w14:val="none"/>
+        </w:rPr>
+        <w:t>FastingBS</w:t>
+      </w:r>
+      <w:proofErr w:type="spellEnd"/>
+      <w:r>
+        <w:rPr>
+          <w:rFonts w:ascii="inherit" w:eastAsia="Times New Roman" w:hAnsi="inherit" w:cs="Arial"/>
+          <w:color w:val="3C4043"/>
+          <w:kern w:val="0"/>
+          <w:sz w:val="21"/>
+          <w:szCs w:val="21"/>
+          <w14:ligatures w14:val="none"/>
+        </w:rPr>
+        <w:t xml:space="preserve">: fasting blood sugar [1: if </w:t>
+      </w:r>
+      <w:proofErr w:type="spellStart"/>
+      <w:r>
+        <w:rPr>
+          <w:rFonts w:ascii="inherit" w:eastAsia="Times New Roman" w:hAnsi="inherit" w:cs="Arial"/>
+          <w:color w:val="3C4043"/>
+          <w:kern w:val="0"/>
+          <w:sz w:val="21"/>
+          <w:szCs w:val="21"/>
+          <w14:ligatures w14:val="none"/>
+        </w:rPr>
+        <w:t>FastingBS</w:t>
+      </w:r>
+      <w:proofErr w:type="spellEnd"/>
+      <w:r>
+        <w:rPr>
+          <w:rFonts w:ascii="inherit" w:eastAsia="Times New Roman" w:hAnsi="inherit" w:cs="Arial"/>
+          <w:color w:val="3C4043"/>
+          <w:kern w:val="0"/>
+          <w:sz w:val="21"/>
+          <w:szCs w:val="21"/>
+          <w14:ligatures w14:val="none"/>
+        </w:rPr>
+        <w:t xml:space="preserve"> &gt; 120 mg/dl, 0: otherwise]</w:t>
       </w:r>
     </w:p>
     <w:p>
@@ -193,16 +256,29 @@
           <w14:ligatures w14:val="none"/>
         </w:rPr>
       </w:pPr>
-      <w:r>
-        <w:rPr>
-          <w:rFonts w:ascii="inherit" w:eastAsia="Times New Roman" w:hAnsi="inherit" w:cs="Arial"/>
-          <w:color w:val="3C4043"/>
-          <w:kern w:val="0"/>
-          <w:sz w:val="21"/>
-          <w:szCs w:val="21"/>
-          <w14:ligatures w14:val="none"/>
-        </w:rPr>
-        <w:t>RestingECG: resting electrocardiogram results [Normal: Normal, ST: having ST-T wave abnormality (T wave inversions and/or ST elevation or depression of &gt; 0.05 mV), LVH: showing probable or definite left ventricular hypertrophy by Estes' criteria]</w:t>
+      <w:proofErr w:type="spellStart"/>
+      <w:r>
+        <w:rPr>
+          <w:rFonts w:ascii="inherit" w:eastAsia="Times New Roman" w:hAnsi="inherit" w:cs="Arial"/>
+          <w:color w:val="3C4043"/>
+          <w:kern w:val="0"/>
+          <w:sz w:val="21"/>
+          <w:szCs w:val="21"/>
+          <w14:ligatures w14:val="none"/>
+        </w:rPr>
+        <w:t>RestingECG</w:t>
+      </w:r>
+      <w:proofErr w:type="spellEnd"/>
+      <w:r>
+        <w:rPr>
+          <w:rFonts w:ascii="inherit" w:eastAsia="Times New Roman" w:hAnsi="inherit" w:cs="Arial"/>
+          <w:color w:val="3C4043"/>
+          <w:kern w:val="0"/>
+          <w:sz w:val="21"/>
+          <w:szCs w:val="21"/>
+          <w14:ligatures w14:val="none"/>
+        </w:rPr>
+        <w:t>: resting electrocardiogram results [Normal: Normal, ST: having ST-T wave abnormality (T wave inversions and/or ST elevation or depression of &gt; 0.05 mV), LVH: showing probable or definite left ventricular hypertrophy by Estes' criteria]</w:t>
       </w:r>
     </w:p>
     <w:p>
@@ -222,16 +298,29 @@
           <w14:ligatures w14:val="none"/>
         </w:rPr>
       </w:pPr>
-      <w:r>
-        <w:rPr>
-          <w:rFonts w:ascii="inherit" w:eastAsia="Times New Roman" w:hAnsi="inherit" w:cs="Arial"/>
-          <w:color w:val="3C4043"/>
-          <w:kern w:val="0"/>
-          <w:sz w:val="21"/>
-          <w:szCs w:val="21"/>
-          <w14:ligatures w14:val="none"/>
-        </w:rPr>
-        <w:t>MaxHR: maximum heart rate achieved [Numeric value between 60 and 202]</w:t>
+      <w:proofErr w:type="spellStart"/>
+      <w:r>
+        <w:rPr>
+          <w:rFonts w:ascii="inherit" w:eastAsia="Times New Roman" w:hAnsi="inherit" w:cs="Arial"/>
+          <w:color w:val="3C4043"/>
+          <w:kern w:val="0"/>
+          <w:sz w:val="21"/>
+          <w:szCs w:val="21"/>
+          <w14:ligatures w14:val="none"/>
+        </w:rPr>
+        <w:t>MaxHR</w:t>
+      </w:r>
+      <w:proofErr w:type="spellEnd"/>
+      <w:r>
+        <w:rPr>
+          <w:rFonts w:ascii="inherit" w:eastAsia="Times New Roman" w:hAnsi="inherit" w:cs="Arial"/>
+          <w:color w:val="3C4043"/>
+          <w:kern w:val="0"/>
+          <w:sz w:val="21"/>
+          <w:szCs w:val="21"/>
+          <w14:ligatures w14:val="none"/>
+        </w:rPr>
+        <w:t>: maximum heart rate achieved [Numeric value between 60 and 202]</w:t>
       </w:r>
     </w:p>
     <w:p>
@@ -251,16 +340,29 @@
           <w14:ligatures w14:val="none"/>
         </w:rPr>
       </w:pPr>
-      <w:r>
-        <w:rPr>
-          <w:rFonts w:ascii="inherit" w:eastAsia="Times New Roman" w:hAnsi="inherit" w:cs="Arial"/>
-          <w:color w:val="3C4043"/>
-          <w:kern w:val="0"/>
-          <w:sz w:val="21"/>
-          <w:szCs w:val="21"/>
-          <w14:ligatures w14:val="none"/>
-        </w:rPr>
-        <w:t>ExerciseAngina: exercise-induced angina [Y: Yes, N: No]</w:t>
+      <w:proofErr w:type="spellStart"/>
+      <w:r>
+        <w:rPr>
+          <w:rFonts w:ascii="inherit" w:eastAsia="Times New Roman" w:hAnsi="inherit" w:cs="Arial"/>
+          <w:color w:val="3C4043"/>
+          <w:kern w:val="0"/>
+          <w:sz w:val="21"/>
+          <w:szCs w:val="21"/>
+          <w14:ligatures w14:val="none"/>
+        </w:rPr>
+        <w:t>ExerciseAngina</w:t>
+      </w:r>
+      <w:proofErr w:type="spellEnd"/>
+      <w:r>
+        <w:rPr>
+          <w:rFonts w:ascii="inherit" w:eastAsia="Times New Roman" w:hAnsi="inherit" w:cs="Arial"/>
+          <w:color w:val="3C4043"/>
+          <w:kern w:val="0"/>
+          <w:sz w:val="21"/>
+          <w:szCs w:val="21"/>
+          <w14:ligatures w14:val="none"/>
+        </w:rPr>
+        <w:t>: exercise-induced angina [Y: Yes, N: No]</w:t>
       </w:r>
     </w:p>
     <w:p>
@@ -280,16 +382,53 @@
           <w14:ligatures w14:val="none"/>
         </w:rPr>
       </w:pPr>
-      <w:r>
-        <w:rPr>
-          <w:rFonts w:ascii="inherit" w:eastAsia="Times New Roman" w:hAnsi="inherit" w:cs="Arial"/>
-          <w:color w:val="3C4043"/>
-          <w:kern w:val="0"/>
-          <w:sz w:val="21"/>
-          <w:szCs w:val="21"/>
-          <w14:ligatures w14:val="none"/>
-        </w:rPr>
-        <w:t>Oldpeak: oldpeak = ST [Numeric value measured in depression]</w:t>
+      <w:proofErr w:type="spellStart"/>
+      <w:r>
+        <w:rPr>
+          <w:rFonts w:ascii="inherit" w:eastAsia="Times New Roman" w:hAnsi="inherit" w:cs="Arial"/>
+          <w:color w:val="3C4043"/>
+          <w:kern w:val="0"/>
+          <w:sz w:val="21"/>
+          <w:szCs w:val="21"/>
+          <w14:ligatures w14:val="none"/>
+        </w:rPr>
+        <w:t>Oldpeak</w:t>
+      </w:r>
+      <w:proofErr w:type="spellEnd"/>
+      <w:r>
+        <w:rPr>
+          <w:rFonts w:ascii="inherit" w:eastAsia="Times New Roman" w:hAnsi="inherit" w:cs="Arial"/>
+          <w:color w:val="3C4043"/>
+          <w:kern w:val="0"/>
+          <w:sz w:val="21"/>
+          <w:szCs w:val="21"/>
+          <w14:ligatures w14:val="none"/>
+        </w:rPr>
+        <w:t xml:space="preserve">: </w:t>
+      </w:r>
+      <w:proofErr w:type="spellStart"/>
+      <w:r>
+        <w:rPr>
+          <w:rFonts w:ascii="inherit" w:eastAsia="Times New Roman" w:hAnsi="inherit" w:cs="Arial"/>
+          <w:color w:val="3C4043"/>
+          <w:kern w:val="0"/>
+          <w:sz w:val="21"/>
+          <w:szCs w:val="21"/>
+          <w14:ligatures w14:val="none"/>
+        </w:rPr>
+        <w:t>oldpeak</w:t>
+      </w:r>
+      <w:proofErr w:type="spellEnd"/>
+      <w:r>
+        <w:rPr>
+          <w:rFonts w:ascii="inherit" w:eastAsia="Times New Roman" w:hAnsi="inherit" w:cs="Arial"/>
+          <w:color w:val="3C4043"/>
+          <w:kern w:val="0"/>
+          <w:sz w:val="21"/>
+          <w:szCs w:val="21"/>
+          <w14:ligatures w14:val="none"/>
+        </w:rPr>
+        <w:t xml:space="preserve"> = ST [Numeric value measured in depression]</w:t>
       </w:r>
     </w:p>
     <w:p>
@@ -309,16 +448,77 @@
           <w14:ligatures w14:val="none"/>
         </w:rPr>
       </w:pPr>
-      <w:r>
-        <w:rPr>
-          <w:rFonts w:ascii="inherit" w:eastAsia="Times New Roman" w:hAnsi="inherit" w:cs="Arial"/>
-          <w:color w:val="3C4043"/>
-          <w:kern w:val="0"/>
-          <w:sz w:val="21"/>
-          <w:szCs w:val="21"/>
-          <w14:ligatures w14:val="none"/>
-        </w:rPr>
-        <w:t>ST_Slope: the slope of the peak exercise ST segment [Up: upsloping, Flat: flat, Down: downsloping]</w:t>
+      <w:proofErr w:type="spellStart"/>
+      <w:r>
+        <w:rPr>
+          <w:rFonts w:ascii="inherit" w:eastAsia="Times New Roman" w:hAnsi="inherit" w:cs="Arial"/>
+          <w:color w:val="3C4043"/>
+          <w:kern w:val="0"/>
+          <w:sz w:val="21"/>
+          <w:szCs w:val="21"/>
+          <w14:ligatures w14:val="none"/>
+        </w:rPr>
+        <w:t>ST_Slope</w:t>
+      </w:r>
+      <w:proofErr w:type="spellEnd"/>
+      <w:r>
+        <w:rPr>
+          <w:rFonts w:ascii="inherit" w:eastAsia="Times New Roman" w:hAnsi="inherit" w:cs="Arial"/>
+          <w:color w:val="3C4043"/>
+          <w:kern w:val="0"/>
+          <w:sz w:val="21"/>
+          <w:szCs w:val="21"/>
+          <w14:ligatures w14:val="none"/>
+        </w:rPr>
+        <w:t xml:space="preserve">: the slope of the peak exercise ST segment [Up: upsloping, Flat: flat, </w:t>
+      </w:r>
+      <w:proofErr w:type="gramStart"/>
+      <w:r>
+        <w:rPr>
+          <w:rFonts w:ascii="inherit" w:eastAsia="Times New Roman" w:hAnsi="inherit" w:cs="Arial"/>
+          <w:color w:val="3C4043"/>
+          <w:kern w:val="0"/>
+          <w:sz w:val="21"/>
+          <w:szCs w:val="21"/>
+          <w14:ligatures w14:val="none"/>
+        </w:rPr>
+        <w:t>Down</w:t>
+      </w:r>
+      <w:proofErr w:type="gramEnd"/>
+      <w:r>
+        <w:rPr>
+          <w:rFonts w:ascii="inherit" w:eastAsia="Times New Roman" w:hAnsi="inherit" w:cs="Arial"/>
+          <w:color w:val="3C4043"/>
+          <w:kern w:val="0"/>
+          <w:sz w:val="21"/>
+          <w:szCs w:val="21"/>
+          <w14:ligatures w14:val="none"/>
+        </w:rPr>
+        <w:t xml:space="preserve">: </w:t>
+      </w:r>
+      <w:proofErr w:type="spellStart"/>
+      <w:r>
+        <w:rPr>
+          <w:rFonts w:ascii="inherit" w:eastAsia="Times New Roman" w:hAnsi="inherit" w:cs="Arial"/>
+          <w:color w:val="3C4043"/>
+          <w:kern w:val="0"/>
+          <w:sz w:val="21"/>
+          <w:szCs w:val="21"/>
+          <w14:ligatures w14:val="none"/>
+        </w:rPr>
+        <w:t>downsloping</w:t>
+      </w:r>
+      <w:proofErr w:type="spellEnd"/>
+      <w:r>
+        <w:rPr>
+          <w:rFonts w:ascii="inherit" w:eastAsia="Times New Roman" w:hAnsi="inherit" w:cs="Arial"/>
+          <w:color w:val="3C4043"/>
+          <w:kern w:val="0"/>
+          <w:sz w:val="21"/>
+          <w:szCs w:val="21"/>
+          <w14:ligatures w14:val="none"/>
+        </w:rPr>
+        <w:t>]</w:t>
       </w:r>
     </w:p>
     <w:p>
@@ -338,16 +538,29 @@
           <w14:ligatures w14:val="none"/>
         </w:rPr>
       </w:pPr>
-      <w:r>
-        <w:rPr>
-          <w:rFonts w:ascii="inherit" w:eastAsia="Times New Roman" w:hAnsi="inherit" w:cs="Arial"/>
-          <w:color w:val="3C4043"/>
-          <w:kern w:val="0"/>
-          <w:sz w:val="21"/>
-          <w:szCs w:val="21"/>
-          <w14:ligatures w14:val="none"/>
-        </w:rPr>
-        <w:t>HeartDisease: output class [1: heart disease, 0: Normal]</w:t>
+      <w:proofErr w:type="spellStart"/>
+      <w:r>
+        <w:rPr>
+          <w:rFonts w:ascii="inherit" w:eastAsia="Times New Roman" w:hAnsi="inherit" w:cs="Arial"/>
+          <w:color w:val="3C4043"/>
+          <w:kern w:val="0"/>
+          <w:sz w:val="21"/>
+          <w:szCs w:val="21"/>
+          <w14:ligatures w14:val="none"/>
+        </w:rPr>
+        <w:t>HeartDisease</w:t>
+      </w:r>
+      <w:proofErr w:type="spellEnd"/>
+      <w:r>
+        <w:rPr>
+          <w:rFonts w:ascii="inherit" w:eastAsia="Times New Roman" w:hAnsi="inherit" w:cs="Arial"/>
+          <w:color w:val="3C4043"/>
+          <w:kern w:val="0"/>
+          <w:sz w:val="21"/>
+          <w:szCs w:val="21"/>
+          <w14:ligatures w14:val="none"/>
+        </w:rPr>
+        <w:t>: output class [1: heart disease, 0: Normal]</w:t>
       </w:r>
     </w:p>
     <w:p/>

</xml_diff>